<commit_message>
chore: remove imports e variáveis não usados (9 avisos do ESLint)
- routes/carrinho.js: estoqueModule
- server.js: setCookie, parseCookies
- teste_avaliacoes.js: construirUpdate, av2, todos, prod1, prod2
- teste_mongo.js: todos
Lint agora: 0 problemas.

Co-Authored-By: Claude Opus 5.5 <noreply@anthropic.com>
</commit_message>
<xml_diff>
--- a/docs/STATUS_LABORATORIO.docx
+++ b/docs/STATUS_LABORATORIO.docx
@@ -2823,43 +2823,116 @@
       </w:pPr>
       <w:r>
         <w:rPr>
+          <w:strike/>
+        </w:rPr>
+        <w:t xml:space="preserve">Limpar os 9 avisos do ESLint</w:t>
+      </w:r>
+      <w:r>
+        <w:t xml:space="preserve"> </w:t>
+      </w:r>
+      <w:r>
+        <w:t xml:space="preserve">— feito em 2026-09-24: imports/variáveis não usados removidos de</w:t>
+      </w:r>
+      <w:r>
+        <w:t xml:space="preserve"> </w:t>
+      </w:r>
+      <w:r>
+        <w:rPr>
+          <w:rStyle w:val="VerbatimChar"/>
+        </w:rPr>
+        <w:t xml:space="preserve">src/server.js</w:t>
+      </w:r>
+      <w:r>
+        <w:t xml:space="preserve">,</w:t>
+      </w:r>
+      <w:r>
+        <w:t xml:space="preserve"> </w:t>
+      </w:r>
+      <w:r>
+        <w:rPr>
+          <w:rStyle w:val="VerbatimChar"/>
+        </w:rPr>
+        <w:t xml:space="preserve">src/routes/carrinho.js</w:t>
+      </w:r>
+      <w:r>
+        <w:t xml:space="preserve">,</w:t>
+      </w:r>
+      <w:r>
+        <w:t xml:space="preserve"> </w:t>
+      </w:r>
+      <w:r>
+        <w:rPr>
+          <w:rStyle w:val="VerbatimChar"/>
+        </w:rPr>
+        <w:t xml:space="preserve">src/teste_avaliacoes.js</w:t>
+      </w:r>
+      <w:r>
+        <w:t xml:space="preserve"> </w:t>
+      </w:r>
+      <w:r>
+        <w:t xml:space="preserve">e</w:t>
+      </w:r>
+      <w:r>
+        <w:t xml:space="preserve"> </w:t>
+      </w:r>
+      <w:r>
+        <w:rPr>
+          <w:rStyle w:val="VerbatimChar"/>
+        </w:rPr>
+        <w:t xml:space="preserve">src/teste_mongo.js</w:t>
+      </w:r>
+      <w:r>
+        <w:t xml:space="preserve">.</w:t>
+      </w:r>
+      <w:r>
+        <w:t xml:space="preserve"> </w:t>
+      </w:r>
+      <w:r>
+        <w:rPr>
+          <w:rStyle w:val="VerbatimChar"/>
+        </w:rPr>
+        <w:t xml:space="preserve">npm run lint</w:t>
+      </w:r>
+      <w:r>
+        <w:t xml:space="preserve"> </w:t>
+      </w:r>
+      <w:r>
+        <w:t xml:space="preserve">agora sai com</w:t>
+      </w:r>
+      <w:r>
+        <w:t xml:space="preserve"> </w:t>
+      </w:r>
+      <w:r>
+        <w:rPr>
           <w:b/>
           <w:bCs/>
         </w:rPr>
-        <w:t xml:space="preserve">Próximos (opcionais):</w:t>
-      </w:r>
-      <w:r>
-        <w:t xml:space="preserve"> </w:t>
-      </w:r>
-      <w:r>
-        <w:t xml:space="preserve">limpar os 9 avisos antigos do ESLint (variáveis não usadas em</w:t>
-      </w:r>
-      <w:r>
-        <w:t xml:space="preserve"> </w:t>
-      </w:r>
-      <w:r>
-        <w:rPr>
-          <w:rStyle w:val="VerbatimChar"/>
-        </w:rPr>
-        <w:t xml:space="preserve">src/server.js</w:t>
-      </w:r>
-      <w:r>
-        <w:t xml:space="preserve">,</w:t>
-      </w:r>
-      <w:r>
-        <w:t xml:space="preserve"> </w:t>
-      </w:r>
-      <w:r>
-        <w:rPr>
-          <w:rStyle w:val="VerbatimChar"/>
-        </w:rPr>
-        <w:t xml:space="preserve">src/routes/carrinho.js</w:t>
-      </w:r>
-      <w:r>
-        <w:t xml:space="preserve"> </w:t>
-      </w:r>
-      <w:r>
-        <w:t xml:space="preserve">e testes); planejar Node 24 → 26 LTS depois de 2026-10-28.</w:t>
+        <w:t xml:space="preserve">0 problemas</w:t>
+      </w:r>
+      <w:r>
+        <w:t xml:space="preserve">.</w:t>
+      </w:r>
+    </w:p>
+    <w:p>
+      <w:pPr>
+        <w:pStyle w:val="Compact"/>
+        <w:numPr>
+          <w:ilvl w:val="0"/>
+          <w:numId w:val="1004"/>
+        </w:numPr>
+      </w:pPr>
+      <w:r>
+        <w:rPr>
+          <w:b/>
+          <w:bCs/>
+        </w:rPr>
+        <w:t xml:space="preserve">Próximo (opcional):</w:t>
+      </w:r>
+      <w:r>
+        <w:t xml:space="preserve"> </w:t>
+      </w:r>
+      <w:r>
+        <w:t xml:space="preserve">planejar Node 24 → 26 LTS depois de 2026-10-28.</w:t>
       </w:r>
     </w:p>
     <w:p>

</xml_diff>

<commit_message>
feat(docker): portas do compose configuráveis + guia para simular 2 devs
- APP_PORT, API_PY_PORT e PG_PORT (padrões 3000/3001/5151 inalterados)
- portas.env no .gitignore (arquivo local de cada dev simulado)
- docs/SIMULANDO_2_DEVS.md (+ .docx), registrado no CLAUDE.md e STATUS

Co-Authored-By: Claude Opus 5.5 <noreply@anthropic.com>
</commit_message>
<xml_diff>
--- a/docs/STATUS_LABORATORIO.docx
+++ b/docs/STATUS_LABORATORIO.docx
@@ -2911,6 +2911,129 @@
       </w:r>
       <w:r>
         <w:t xml:space="preserve">.</w:t>
+      </w:r>
+    </w:p>
+    <w:p>
+      <w:pPr>
+        <w:pStyle w:val="Compact"/>
+        <w:numPr>
+          <w:ilvl w:val="0"/>
+          <w:numId w:val="1004"/>
+        </w:numPr>
+      </w:pPr>
+      <w:r>
+        <w:rPr>
+          <w:strike/>
+        </w:rPr>
+        <w:t xml:space="preserve">Simular 2 devs com containers</w:t>
+      </w:r>
+      <w:r>
+        <w:t xml:space="preserve"> </w:t>
+      </w:r>
+      <w:r>
+        <w:t xml:space="preserve">— feito em 2026-09-24: portas do</w:t>
+      </w:r>
+      <w:r>
+        <w:t xml:space="preserve"> </w:t>
+      </w:r>
+      <w:r>
+        <w:rPr>
+          <w:rStyle w:val="VerbatimChar"/>
+        </w:rPr>
+        <w:t xml:space="preserve">docker-compose.yml</w:t>
+      </w:r>
+      <w:r>
+        <w:t xml:space="preserve"> </w:t>
+      </w:r>
+      <w:r>
+        <w:t xml:space="preserve">configuráveis (</w:t>
+      </w:r>
+      <w:r>
+        <w:rPr>
+          <w:rStyle w:val="VerbatimChar"/>
+        </w:rPr>
+        <w:t xml:space="preserve">APP_PORT</w:t>
+      </w:r>
+      <w:r>
+        <w:t xml:space="preserve">,</w:t>
+      </w:r>
+      <w:r>
+        <w:t xml:space="preserve"> </w:t>
+      </w:r>
+      <w:r>
+        <w:rPr>
+          <w:rStyle w:val="VerbatimChar"/>
+        </w:rPr>
+        <w:t xml:space="preserve">API_PY_PORT</w:t>
+      </w:r>
+      <w:r>
+        <w:t xml:space="preserve">,</w:t>
+      </w:r>
+      <w:r>
+        <w:t xml:space="preserve"> </w:t>
+      </w:r>
+      <w:r>
+        <w:rPr>
+          <w:rStyle w:val="VerbatimChar"/>
+        </w:rPr>
+        <w:t xml:space="preserve">PG_PORT</w:t>
+      </w:r>
+      <w:r>
+        <w:t xml:space="preserve">, padrões inalterados); pastas</w:t>
+      </w:r>
+      <w:r>
+        <w:t xml:space="preserve"> </w:t>
+      </w:r>
+      <w:r>
+        <w:rPr>
+          <w:rStyle w:val="VerbatimChar"/>
+        </w:rPr>
+        <w:t xml:space="preserve">~/devs/dev1</w:t>
+      </w:r>
+      <w:r>
+        <w:t xml:space="preserve"> </w:t>
+      </w:r>
+      <w:r>
+        <w:t xml:space="preserve">(localhost:3010) e</w:t>
+      </w:r>
+      <w:r>
+        <w:t xml:space="preserve"> </w:t>
+      </w:r>
+      <w:r>
+        <w:rPr>
+          <w:rStyle w:val="VerbatimChar"/>
+        </w:rPr>
+        <w:t xml:space="preserve">~/devs/dev2</w:t>
+      </w:r>
+      <w:r>
+        <w:t xml:space="preserve"> </w:t>
+      </w:r>
+      <w:r>
+        <w:t xml:space="preserve">(localhost:3020), cada uma com clone, autor Git próprio e</w:t>
+      </w:r>
+      <w:r>
+        <w:t xml:space="preserve"> </w:t>
+      </w:r>
+      <w:r>
+        <w:rPr>
+          <w:rStyle w:val="VerbatimChar"/>
+        </w:rPr>
+        <w:t xml:space="preserve">portas.env</w:t>
+      </w:r>
+      <w:r>
+        <w:t xml:space="preserve">. Guia:</w:t>
+      </w:r>
+      <w:r>
+        <w:t xml:space="preserve"> </w:t>
+      </w:r>
+      <w:r>
+        <w:rPr>
+          <w:rStyle w:val="VerbatimChar"/>
+        </w:rPr>
+        <w:t xml:space="preserve">docs/SIMULANDO_2_DEVS.md</w:t>
+      </w:r>
+      <w:r>
+        <w:t xml:space="preserve">. Card de exemplo para praticar: #27.</w:t>
       </w:r>
     </w:p>
     <w:p>

</xml_diff>